<commit_message>
Final round of edits
</commit_message>
<xml_diff>
--- a/poetry/freeform/flotsam-and-jetsam/the-art-wants-what-it-wants.docx
+++ b/poetry/freeform/flotsam-and-jetsam/the-art-wants-what-it-wants.docx
@@ -4,7 +4,10 @@
   <w:body>
     <w:p>
       <w:r>
-        <w:t>the art wants what it wants--</w:t>
+        <w:t>the art wants what it wants</w:t>
+      </w:r>
+      <w:r>
+        <w:t>—</w:t>
       </w:r>
       <w:r>
         <w:br/>
@@ -144,7 +147,10 @@
         <w:br/>
       </w:r>
       <w:r>
-        <w:t>the art wants me to never finish any--</w:t>
+        <w:t>the art wants me to never finish any</w:t>
+      </w:r>
+      <w:r>
+        <w:t>—</w:t>
       </w:r>
     </w:p>
     <w:sectPr>
@@ -970,7 +976,6 @@
   <w:style w:type="character" w:default="1" w:styleId="DefaultParagraphFont">
     <w:name w:val="Default Paragraph Font"/>
     <w:uiPriority w:val="1"/>
-    <w:semiHidden/>
     <w:unhideWhenUsed/>
   </w:style>
   <w:style w:type="table" w:default="1" w:styleId="TableNormal">

</xml_diff>